<commit_message>
Align interim presentation materials with thesis findings and final controller plans
</commit_message>
<xml_diff>
--- a/docs/abstract/アブスト_主要事項.docx
+++ b/docs/abstract/アブスト_主要事項.docx
@@ -10,17 +10,6 @@
         <w:t>FPGAを用いた二次元ゲーム機の設計と実装</w:t>
       </w:r>
     </w:p>
-    <w:p>
-      <w:pPr>
-        <w:pStyle w:val="a5"/>
-      </w:pPr>
-    </w:p>
-    <w:p>
-      <w:pPr>
-        <w:pStyle w:val="a5"/>
-      </w:pPr>
-    </w:p>
-    <w:p/>
     <w:p>
       <w:pPr>
         <w:rPr>
@@ -47,23 +36,23 @@
         <w:pStyle w:val="a9"/>
       </w:pPr>
       <w:r>
-        <w:t>FPGAは，内部に作る回路の構成を設定できるチップである．本研究では，教科書RISC-V System-on-Chip Designで扱うCPUのWally[Harris26]に描画・表示機能を加え，ブロック崩しを動かした．目的は，Wallyの学習者が周辺機能を追加するときに参照できる，接続設計と動作確認の結果を示すことである．</w:t>
+        <w:t>FPGAは，内部の回路構成を設定できるチップである．本研究では，教科書RISC-V System-on-Chip DesignのCPUであるWally[Harris26]に描画・表示機能を加え，ブロック崩しを動かした．Wallyの学習者が周辺機能を追加する際に参照できる，接続設計と動作確認の結果を示す．</w:t>
+      </w:r>
+    </w:p>
+    <w:p>
+      <w:pPr>
+        <w:pStyle w:val="1"/>
+      </w:pPr>
+      <w:r>
+        <w:t xml:space="preserve">2  ゲーム機の設計</w:t>
       </w:r>
     </w:p>
     <w:p>
       <w:pPr>
         <w:pStyle w:val="a9"/>
-        <w:ind w:left="0" w:right="0" w:firstLine="0" w:firstLineChars="0"/>
-        <w:spacing w:line="120" w:lineRule="exact"/>
-        <w:snapToGrid w:val="0"/>
-      </w:pPr>
-    </w:p>
-    <w:p>
-      <w:pPr>
-        <w:pStyle w:val="1"/>
-      </w:pPr>
-      <w:r>
-        <w:t xml:space="preserve">2  ゲーム機の設計</w:t>
+      </w:pPr>
+      <w:r>
+        <w:t>基板Nexys VideoのFPGA内に，Wallyと公開設計の描画回路RasterIX[RasterIX]を組み込んだ．CPUはSDカードから読み込んだゲームを実行し，図形の位置や色を描画命令としてメモリに用意して送る．RasterIXは画像をDDR3メモリへ保存し，表示回路が読み出してHDMI端子へ送る（図1）．基板に合わせた設定と，命令・画像を受け渡す接続を実装した．標準構成では公式RasterIXの内部を変更していない．</w:t>
       </w:r>
     </w:p>
     <w:p>
@@ -71,24 +60,8 @@
         <w:pStyle w:val="a9"/>
       </w:pPr>
       <w:r>
-        <w:t>基板Nexys VideoのFPGA内に，Wallyと公開設計の描画回路RasterIX[RasterIX]を組み込んだ．CPUはSDカードから読み込んだゲームを実行し，図形の位置や色を表す描画命令をメモリに用意して送る．RasterIXが画像をDDR3メモリへ保存し，表示回路が読み出してHDMI端子へ送る（図1）．基板の端子・メモリ・クロックに合わせた設定と，命令や画像を受け渡す接続を実装した．公式RasterIXの内部は変更していない．</w:t>
-      </w:r>
-    </w:p>
-    <w:p>
-      <w:pPr>
-        <w:pStyle w:val="a9"/>
-      </w:pPr>
-      <w:r>
-        <w:t>CPUと描画側は20 MHzと100 MHzで動くため，両側のクロックに対応して命令を順番に預かるFIFOを置いた．空きがあればCPUは次の命令を送り，満杯なら待つ．また，二枚分の画像領域を用意し，一方を表示している間に他方へ描く．表示先の切り替えと古い画像の読み出し完了を確認してから，古い領域を次の描画に使う（図2）．</w:t>
-      </w:r>
-    </w:p>
-    <w:p>
-      <w:pPr>
-        <w:pStyle w:val="a9"/>
-        <w:ind w:left="0" w:right="0" w:firstLine="0" w:firstLineChars="0"/>
-        <w:spacing w:line="120" w:lineRule="exact"/>
-        <w:snapToGrid w:val="0"/>
-      </w:pPr>
+        <w:t>CPUと描画側は20 MHzと100 MHzで動くため，両側のクロックに対応して命令を順番に預かるFIFOを置いた．空きがあればCPUは次の命令を送り，満杯なら待つ．また，二枚分の画像領域を用意し，一方を表示している間に他方へ描く．表示先の切り替えと古い画像の読み出し完了を確認してから，古い領域を次の描画に使う（図2）．CPUの描画準備を減らすため，同じ設定の図形をまとめ，変化した領域だけを描き直す．</w:t>
+      </w:r>
     </w:p>
     <w:p>
       <w:pPr>
@@ -237,40 +210,24 @@
         <w:pStyle w:val="a9"/>
       </w:pPr>
       <w:r>
-        <w:t>三接続方式の比較では，選んだ27条件の最終画像について，全307,200画素が正解画像と一致した．計測回路を除いた通常版では，640×480画素のブロック崩しが5分間の自動プレイを継続した．別途保存した30秒の実機映像でも，ボールの移動を確認した．一方，大きなテクスチャの描画と映像機器での認識には，未解決の条件が残った．</w:t>
+        <w:t>三接続方式の27条件で，最終画像の全307,200画素が期待画像と一致した．640×480画素で，通常版の5分間の自動プレイと，別に30秒の実機映像を確認した．命令の自動転送も実験用構成で試したが，コピーを含めると速くならなかった．描画用内部メモリを2倍にした効果も，試した条件では小さかった．</w:t>
+      </w:r>
+    </w:p>
+    <w:p>
+      <w:pPr>
+        <w:pStyle w:val="1"/>
+      </w:pPr>
+      <w:r>
+        <w:t xml:space="preserve">4  おわりに</w:t>
       </w:r>
     </w:p>
     <w:p>
       <w:pPr>
         <w:pStyle w:val="a9"/>
-        <w:ind w:left="0" w:right="0" w:firstLine="0" w:firstLineChars="0"/>
-        <w:spacing w:line="120" w:lineRule="exact"/>
-        <w:snapToGrid w:val="0"/>
-      </w:pPr>
-    </w:p>
-    <w:p>
-      <w:pPr>
-        <w:pStyle w:val="1"/>
-      </w:pPr>
-      <w:r>
-        <w:t xml:space="preserve">4  おわりに</w:t>
-      </w:r>
-    </w:p>
-    <w:p>
-      <w:pPr>
-        <w:pStyle w:val="a9"/>
-      </w:pPr>
-      <w:r>
-        <w:t>CPU，描画回路，メモリ，表示を接続し，二次元ゲームを動かす構成を示した．命令の渡し方を比較し，採用した接続の待ち時間と回路量を確認した．設計理由，ソース，試験条件を公開資料にまとめ，同様の拡張の参照例とする．専用ゲームコントローラーの接続と，残る描画・映像受信の問題の検証が課題である．</w:t>
-      </w:r>
-    </w:p>
-    <w:p>
-      <w:pPr>
-        <w:pStyle w:val="a9"/>
-        <w:ind w:left="0" w:right="0" w:firstLine="0" w:firstLineChars="0"/>
-        <w:spacing w:line="120" w:lineRule="exact"/>
-        <w:snapToGrid w:val="0"/>
-      </w:pPr>
+      </w:pPr>
+      <w:r>
+        <w:t>二次元ゲームの動作を確認し，接続設計と試験条件をソースとともに公開した．Wallyを拡張する学習者の参照例とする．大きなテクスチャの描画と映像認識には未解決の条件が残る．最終発表では，Wii Classic Controller Proを接続し，ボタンによるゲーム操作を検証する．</w:t>
+      </w:r>
     </w:p>
     <w:p>
       <w:pPr>

</xml_diff>

<commit_message>
Refocus research documents on console integration
Move OpenGL batching and partial redraw, Nexys Video board adaptation,
and DVI aspect-ratio details into the technical appendix while preserving
their figures and measurements.

Align the thesis, abstract, and slides around connection design and
validation, use full-frame results for connection comparisons, and update
cross-references and generated documents. Expand explanatory figures and
keep the publication manifest synchronized.
</commit_message>
<xml_diff>
--- a/docs/abstract/アブスト_主要事項.docx
+++ b/docs/abstract/アブスト_主要事項.docx
@@ -52,7 +52,7 @@
         <w:pStyle w:val="a9"/>
       </w:pPr>
       <w:r>
-        <w:t>基板Nexys VideoのFPGA内に，Wallyと公開設計の描画回路RasterIX[RasterIX]を組み込んだ．CPUはSDカードから読み込んだゲームを実行し，図形の位置や色を描画命令としてメモリに用意して送る．RasterIXは画像をDDR3メモリへ保存し，表示回路が読み出してHDMI端子へ送る（図1）．基板に合わせた設定と，命令・画像を受け渡す接続を実装した．標準構成では公式RasterIXの内部を変更していない．</w:t>
+        <w:t>基板Nexys VideoのFPGA内に，Wallyと公開設計の描画回路RasterIX[RasterIX]を組み込んだ．CPUはSDカードから読み込んだゲームを実行し，図形の位置や色を描画命令としてメモリに用意して送る．RasterIXは画像をDDR3メモリへ保存し，表示回路が読み出してHDMI端子へ送る（図1）．命令・画像を受け渡す接続を実装した．標準構成では公式RasterIXの内部を変更していない．</w:t>
       </w:r>
     </w:p>
     <w:p>
@@ -60,7 +60,7 @@
         <w:pStyle w:val="a9"/>
       </w:pPr>
       <w:r>
-        <w:t>CPUと描画側は20 MHzと100 MHzで動くため，両側のクロックに対応して命令を順番に預かるFIFOを置いた．空きがあればCPUは次の命令を送り，満杯なら待つ．また，二枚分の画像領域を用意し，一方を表示している間に他方へ描く．表示先の切り替えと古い画像の読み出し完了を確認してから，古い領域を次の描画に使う（図2）．CPUの描画準備を減らすため，同じ設定の図形をまとめ，変化した領域だけを描き直す．</w:t>
+        <w:t>CPUと描画側は20 MHzと100 MHzで動くため，両側のクロックに対応して命令を順番に預かるFIFOを置いた．空きがあればCPUは次の命令を送り，満杯なら待つ．また，二枚分の画像領域を用意し，一方を表示している間に他方へ描く．表示先の切り替えと古い画像の読み出し完了を確認してから，古い領域を次の描画に使う（図2）．</w:t>
       </w:r>
     </w:p>
     <w:p>
@@ -210,7 +210,7 @@
         <w:pStyle w:val="a9"/>
       </w:pPr>
       <w:r>
-        <w:t>三接続方式の27条件で，最終画像の全307,200画素が期待画像と一致した．640×480画素で，通常版の5分間の自動プレイと，別に30秒の実機映像を確認した．命令の自動転送も実験用構成で試したが，コピーを含めると速くならなかった．描画用内部メモリを2倍にした効果も，試した条件では小さかった．</w:t>
+        <w:t>三接続方式・三開始状態の全体描画で，9枚の最終画像の全307,200画素が期待画像と一致した．比較試験とは別に，640×480画素の通常版で5分間の自動プレイと30秒の実機映像を確認した．命令の自動転送も実験用構成で試したが，コピーを含めると速くならなかった．描画用内部メモリを2倍にした効果も，試した全体描画の条件では小さかった．</w:t>
       </w:r>
     </w:p>
     <w:p>

</xml_diff>

<commit_message>
Focus research documents on console integration
</commit_message>
<xml_diff>
--- a/docs/abstract/アブスト_主要事項.docx
+++ b/docs/abstract/アブスト_主要事項.docx
@@ -36,7 +36,7 @@
         <w:pStyle w:val="a9"/>
       </w:pPr>
       <w:r>
-        <w:t>FPGAは，内部の回路構成を設定できるチップである．本研究では，教科書RISC-V System-on-Chip DesignのCPUであるWally[Harris26]に描画・表示機能を加え，ブロック崩しを動かした．Wallyの学習者が周辺機能を追加する際に参照できる，接続設計と動作確認の結果を示す．</w:t>
+        <w:t>本研究では，教科書RISC-V System-on-Chip DesignのCPUであるWally[Harris26]に描画・表示機能を加え，ブロック崩しを動かすゲーム機を実装した．Wallyの学習者が周辺機能を追加するときに参照できるよう，接続の設計と実機での動作確認を示す．</w:t>
       </w:r>
     </w:p>
     <w:p>
@@ -52,7 +52,7 @@
         <w:pStyle w:val="a9"/>
       </w:pPr>
       <w:r>
-        <w:t>基板Nexys VideoのFPGA内に，Wallyと公開設計の描画回路RasterIX[RasterIX]を組み込んだ．CPUはSDカードから読み込んだゲームを実行し，図形の位置や色を描画命令としてメモリに用意して送る．RasterIXは画像をDDR3メモリへ保存し，表示回路が読み出してHDMI端子へ送る（図1）．命令・画像を受け渡す接続を実装した．標準構成では公式RasterIXの内部を変更していない．</w:t>
+        <w:t>内部の回路構成を設定できるFPGAを用い，基板Nexys Video上にWallyと公開設計の描画回路RasterIX[RasterIX]を組み込んだ．ゲームはCPU上で動き，RasterIX付属のOpenGL互換ライブラリへ図形の位置や色を渡す．ライブラリが作る描画命令を回路へ送り，出来た画像をDDR3メモリへ保存し，表示回路がHDMI端子へ送り出す（図1）．</w:t>
       </w:r>
     </w:p>
     <w:p>
@@ -60,7 +60,7 @@
         <w:pStyle w:val="a9"/>
       </w:pPr>
       <w:r>
-        <w:t>CPUと描画側は20 MHzと100 MHzで動くため，両側のクロックに対応して命令を順番に預かるFIFOを置いた．空きがあればCPUは次の命令を送り，満杯なら待つ．また，二枚分の画像領域を用意し，一方を表示している間に他方へ描く．表示先の切り替えと古い画像の読み出し完了を確認してから，古い領域を次の描画に使う（図2）．</w:t>
+        <w:t>本研究で設計したのは，命令を渡す接続，画像を置くメモリの設定，表示画像の切り替え制御である．CPU側20 MHzと描画側100 MHzの間には，別々のクロックで命令を順に受け渡す非同期FIFOを用いた．また，Linux用と画像用のメモリ領域を分けた．二枚の画像領域を用意し，一方を表示中に他方へ描き，古い画像の読み出しが終わったことを確認してから役割を交代させる（図2）．公式RasterIXの内部は変更していない．</w:t>
       </w:r>
     </w:p>
     <w:p>
@@ -139,7 +139,7 @@
         <w:pStyle w:val="a9"/>
       </w:pPr>
       <w:r>
-        <w:t>同じゲームを用い，一語ずつ受取確認を待つ接続と，16語・512語のFIFOを実機で比較した．初期状態の全体描画では，命令の書き込み中にCPUが待つ時間は，一語方式の4.393 msから512語FIFOの0.465 msへ減った．512語FIFOの保存には18 KbitのBlock RAMを1個使った．この時間はゲーム全体の処理時間ではない．</w:t>
+        <w:t>回路シミュレーションで，命令の受け取りやメモリ応答を遅らせ，データの保持と表示切り替えを確認した．実機では640×480画素のブロック崩しを動かした．通常構成で実行した四つの確認条件について，保存した各画像の全307,200画素が期待画像と一致した．</w:t>
       </w:r>
     </w:p>
     <w:p>
@@ -210,7 +210,7 @@
         <w:pStyle w:val="a9"/>
       </w:pPr>
       <w:r>
-        <w:t>三接続方式・三開始状態の全体描画で，9枚の最終画像の全307,200画素が期待画像と一致した．比較試験とは別に，640×480画素の通常版で5分間の自動プレイと30秒の実機映像を確認した．命令の自動転送も実験用構成で試したが，コピーを含めると速くならなかった．描画用内部メモリを2倍にした効果も，試した全体描画の条件では小さかった．</w:t>
+        <w:t>さらに，5分間の自動プレイの実行記録と，別の実行で保存した30秒間の映像を確認した．動作確認には，描画処理を軽くする実装を含む完成版を用いた．本報告は接続と動作を評価し，個々の高速化の効果は評価対象としない．</w:t>
       </w:r>
     </w:p>
     <w:p>
@@ -226,7 +226,7 @@
         <w:pStyle w:val="a9"/>
       </w:pPr>
       <w:r>
-        <w:t>二次元ゲームの動作を確認し，接続設計と試験条件をソースとともに公開した．Wallyを拡張する学習者の参照例とする．大きなテクスチャの描画と映像認識には未解決の条件が残る．最終発表では，Wii Classic Controller Proを接続し，ボタンによるゲーム操作を検証する．</w:t>
+        <w:t>Wallyに描画・表示機能を加え，二次元ゲームが動く構成を実機で確認した．接続設計，ソース，試験条件を公開し，拡張を行う学習者の参照例とする．映像受信が安定しない条件の解明は課題である．最終発表ではWii Classic Controller Proを接続し，ボタンによるゲーム操作を検証する．</w:t>
       </w:r>
     </w:p>
     <w:p>

</xml_diff>

<commit_message>
Clarify the abstract and illustrate the rendering flow
</commit_message>
<xml_diff>
--- a/docs/abstract/アブスト_主要事項.docx
+++ b/docs/abstract/アブスト_主要事項.docx
@@ -36,7 +36,7 @@
         <w:pStyle w:val="a9"/>
       </w:pPr>
       <w:r>
-        <w:t>本研究では，教科書RISC-V System-on-Chip DesignのCPUであるWally[Harris26]に描画・表示機能を加え，ブロック崩しを動かすゲーム機を実装した．Wallyの学習者が周辺機能を追加するときに参照できるよう，接続の設計と実機での動作確認を示す．</w:t>
+        <w:t>本研究では，CPUに画面を描く機能を加え，ブロック崩しが動くゲーム機を製作した．CPUには，教科書RISC-V System-on-Chip Designで設計を学べるWally[Harris26]を用いた．目的は，Wallyの学習者が，CPUに別の回路をつないで機能を増やす際に参照できる例を示すことである．</w:t>
       </w:r>
     </w:p>
     <w:p>
@@ -52,7 +52,7 @@
         <w:pStyle w:val="a9"/>
       </w:pPr>
       <w:r>
-        <w:t>内部の回路構成を設定できるFPGAを用い，基板Nexys Video上にWallyと公開設計の描画回路RasterIX[RasterIX]を組み込んだ．ゲームはCPU上で動き，RasterIX付属のOpenGL互換ライブラリへ図形の位置や色を渡す．ライブラリが作る描画命令を回路へ送り，出来た画像をDDR3メモリへ保存し，表示回路がHDMI端子へ送り出す（図1）．</w:t>
+        <w:t>FPGAは，内部に作る論理回路を変更できる半導体チップである．Nexys Videoという基板上のFPGAに，CPUのWallyと，画像を作る回路RasterIX[RasterIX]を実装した．CPUはSDカードから読み込んだゲームプログラムを実行し，ボールの位置などを計算する．</w:t>
       </w:r>
     </w:p>
     <w:p>
@@ -60,7 +60,7 @@
         <w:pStyle w:val="a9"/>
       </w:pPr>
       <w:r>
-        <w:t>本研究で設計したのは，命令を渡す接続，画像を置くメモリの設定，表示画像の切り替え制御である．CPU側20 MHzと描画側100 MHzの間には，別々のクロックで命令を順に受け渡す非同期FIFOを用いた．また，Linux用と画像用のメモリ領域を分けた．二枚の画像領域を用意し，一方を表示中に他方へ描き，古い画像の読み出しが終わったことを確認してから役割を交代させる（図2）．公式RasterIXの内部は変更していない．</w:t>
+        <w:t>ゲームプログラムは，RasterIX付属のOpenGL互換ライブラリ（図形を描くためのソフトウェア）に，図形の位置や色を渡す．ライブラリはそれを描画回路への命令に変換する．RasterIXは命令に従って画像を作り，各点（画素）の色をメモリに保存する．表示回路がその画像を読み出し，HDMI端子から映像として出力する（図1）．</w:t>
       </w:r>
     </w:p>
     <w:p>
@@ -72,8 +72,8 @@
       <w:r>
         <w:drawing>
           <wp:inline xmlns:a="http://schemas.openxmlformats.org/drawingml/2006/main" xmlns:pic="http://schemas.openxmlformats.org/drawingml/2006/picture">
-            <wp:extent cx="2988000" cy="2202692"/>
-            <wp:docPr id="9001" name="Game console processing flow" descr="CPUが位置を計算し，描画回路が画像をメモリへ保存し，表示回路が画面へ送る流れ"/>
+            <wp:extent cx="2988000" cy="2315700"/>
+            <wp:docPr id="201" name="Picture 201" descr="上からCPU Wally、描画回路RasterIX、画像を保存するメモリ、表示回路の順。CPUからの命令は接続回路を通る。青は追加した描画と表示の機能。"/>
             <wp:cNvGraphicFramePr>
               <a:graphicFrameLocks noChangeAspect="1"/>
             </wp:cNvGraphicFramePr>
@@ -81,11 +81,11 @@
               <a:graphicData uri="http://schemas.openxmlformats.org/drawingml/2006/picture">
                 <pic:pic>
                   <pic:nvPicPr>
-                    <pic:cNvPr id="0" name="console-flow.png"/>
+                    <pic:cNvPr id="0" name="game-flow.png"/>
                     <pic:cNvPicPr/>
                   </pic:nvPicPr>
                   <pic:blipFill>
-                    <a:blip r:embed="rIdAbstractDiagram"/>
+                    <a:blip r:embed="rId1"/>
                     <a:stretch>
                       <a:fillRect/>
                     </a:stretch>
@@ -93,7 +93,7 @@
                   <pic:spPr>
                     <a:xfrm>
                       <a:off x="0" y="0"/>
-                      <a:ext cx="2988000" cy="2202692"/>
+                      <a:ext cx="2988000" cy="2315700"/>
                     </a:xfrm>
                     <a:prstGeom prst="rect"/>
                   </pic:spPr>
@@ -107,6 +107,7 @@
     <w:p>
       <w:pPr>
         <w:pStyle w:val="a9"/>
+        <w:keepNext w:val="0"/>
         <w:ind w:left="0" w:right="0" w:firstLine="0" w:firstLineChars="0"/>
         <w:jc w:val="center"/>
       </w:pPr>
@@ -114,15 +115,23 @@
         <w:rPr>
           <w:b/>
           <w:color w:val="1673C3"/>
-          <w:b/>
         </w:rPr>
-        <w:t>図1</w:t>
+        <w:t xml:space="preserve">図1  </w:t>
       </w:r>
       <w:r>
         <w:rPr>
           <w:b/>
+          <w:color w:val="000000"/>
         </w:rPr>
-        <w:t xml:space="preserve">  CPUの計算から画面へ届くまでの流れ</w:t>
+        <w:t>CPUの計算が画面になるまで</w:t>
+      </w:r>
+    </w:p>
+    <w:p>
+      <w:pPr>
+        <w:pStyle w:val="a9"/>
+      </w:pPr>
+      <w:r>
+        <w:t>本研究で設計した接続回路は，CPUから来る命令を一時的に保存し，RasterIXが受け取れるときに順に渡す．この回路で，データの渡し方と動作のタイミングが異なる二つの回路をつないだ．また，プログラムと画像が互いの保存場所を上書きしないよう，メモリの使う範囲を分けた．表示中の画像を書き換えないように，二枚の画像を交互に描画用・表示用として使う制御も実装した．公式RasterIXの内部は変更していない．</w:t>
       </w:r>
     </w:p>
     <w:p>
@@ -139,7 +148,23 @@
         <w:pStyle w:val="a9"/>
       </w:pPr>
       <w:r>
-        <w:t>回路シミュレーションで，命令の受け取りやメモリ応答を遅らせ，データの保持と表示切り替えを確認した．実機では640×480画素のブロック崩しを動かした．通常構成で実行した四つの確認条件について，保存した各画像の全307,200画素が期待画像と一致した．</w:t>
+        <w:t>回路シミュレーションでは，描画回路の受け取りを一時的に止め，再開後に命令が欠けたり重複したりせずに届くことを確認した．</w:t>
+      </w:r>
+    </w:p>
+    <w:p>
+      <w:pPr>
+        <w:pStyle w:val="a9"/>
+      </w:pPr>
+      <w:r>
+        <w:t>実機では640×480画素のブロック崩しを動かした．実機のメモリから取り出した四枚のゲーム画像を，CPUで別に作った比較用画像と照合したところ，全画素の色が一致した．</w:t>
+      </w:r>
+    </w:p>
+    <w:p>
+      <w:pPr>
+        <w:pStyle w:val="a9"/>
+      </w:pPr>
+      <w:r>
+        <w:t>自動操作による5分間の実行では，ゲームの計算と画面の更新が続いた．別の実行で記録した30秒間の映像でも，ボールが動くことを確認した（図2）．試験には，描画処理を軽くする工夫を加えたゲームを用いた．</w:t>
       </w:r>
     </w:p>
     <w:p>
@@ -151,8 +176,8 @@
       <w:r>
         <w:drawing>
           <wp:inline xmlns:a="http://schemas.openxmlformats.org/drawingml/2006/main" xmlns:pic="http://schemas.openxmlformats.org/drawingml/2006/picture">
-            <wp:extent cx="2988000" cy="1838769"/>
-            <wp:docPr id="200" name="Image buffer switching" descr="画像Aを表示しながらBを描き，読み出しの完了を確認して役割を交換する"/>
+            <wp:extent cx="2988000" cy="1680750"/>
+            <wp:docPr id="202" name="Picture 202" descr="実機のHDMI映像から取り出したブロック崩しの画面。色付きのブロック、白いボールとパドルが描かれている。自動操作で確認した。"/>
             <wp:cNvGraphicFramePr>
               <a:graphicFrameLocks noChangeAspect="1"/>
             </wp:cNvGraphicFramePr>
@@ -160,11 +185,11 @@
               <a:graphicData uri="http://schemas.openxmlformats.org/drawingml/2006/picture">
                 <pic:pic>
                   <pic:nvPicPr>
-                    <pic:cNvPr id="200" name="Image buffer switching"/>
+                    <pic:cNvPr id="0" name="fifo-study-game.png"/>
                     <pic:cNvPicPr/>
                   </pic:nvPicPr>
                   <pic:blipFill>
-                    <a:blip r:embed="rIdImageBufferExplanation"/>
+                    <a:blip r:embed="rId6"/>
                     <a:stretch>
                       <a:fillRect/>
                     </a:stretch>
@@ -172,7 +197,7 @@
                   <pic:spPr>
                     <a:xfrm>
                       <a:off x="0" y="0"/>
-                      <a:ext cx="2988000" cy="1838769"/>
+                      <a:ext cx="2988000" cy="1680750"/>
                     </a:xfrm>
                     <a:prstGeom prst="rect"/>
                   </pic:spPr>
@@ -186,23 +211,31 @@
     <w:p>
       <w:pPr>
         <w:pStyle w:val="a9"/>
+        <w:keepNext w:val="0"/>
         <w:ind w:left="0" w:right="0" w:firstLine="0" w:firstLineChars="0"/>
         <w:jc w:val="center"/>
       </w:pPr>
       <w:r>
         <w:rPr>
           <w:b/>
-          <w:b/>
           <w:color w:val="1673C3"/>
-          <w:b/>
         </w:rPr>
-        <w:t>図2</w:t>
+        <w:t xml:space="preserve">図2  </w:t>
       </w:r>
       <w:r>
         <w:rPr>
           <w:b/>
+          <w:color w:val="000000"/>
         </w:rPr>
-        <w:t xml:space="preserve">  二枚の保存場所の使い分け</w:t>
+        <w:t>実機から記録したブロック崩しの映像</w:t>
+      </w:r>
+    </w:p>
+    <w:p>
+      <w:pPr>
+        <w:pStyle w:val="1"/>
+      </w:pPr>
+      <w:r>
+        <w:t xml:space="preserve">4  おわりに</w:t>
       </w:r>
     </w:p>
     <w:p>
@@ -210,23 +243,7 @@
         <w:pStyle w:val="a9"/>
       </w:pPr>
       <w:r>
-        <w:t>さらに，5分間の自動プレイの実行記録と，別の実行で保存した30秒間の映像を確認した．動作確認には，描画処理を軽くする実装を含む完成版を用いた．本報告は接続と動作を評価し，個々の高速化の効果は評価対象としない．</w:t>
-      </w:r>
-    </w:p>
-    <w:p>
-      <w:pPr>
-        <w:pStyle w:val="1"/>
-      </w:pPr>
-      <w:r>
-        <w:t xml:space="preserve">4  おわりに</w:t>
-      </w:r>
-    </w:p>
-    <w:p>
-      <w:pPr>
-        <w:pStyle w:val="a9"/>
-      </w:pPr>
-      <w:r>
-        <w:t>Wallyに描画・表示機能を加え，二次元ゲームが動く構成を実機で確認した．接続設計，ソース，試験条件を公開し，拡張を行う学習者の参照例とする．映像受信が安定しない条件の解明は課題である．最終発表ではWii Classic Controller Proを接続し，ボタンによるゲーム操作を検証する．</w:t>
+        <w:t>Wallyに描画・表示機能を加え，二次元ゲームを動かせた．回路のつなぎ方と動作確認の手順を公開し，Wallyに機能を追加する学習者が参照できる例とした．映像を受信できない場合があり，原因の解明が課題である．最終発表ではWii Classic Controller Proを接続し，ボタンによるゲーム操作を確認する．</w:t>
       </w:r>
     </w:p>
     <w:p>

</xml_diff>

<commit_message>
Improve research overview and presentation materials
Explain the console architecture and add the existing gameplay recording
to the research README with links to the detailed documents.

Align the abstract with the presentation, use numbered references, and
render its figure labels in black. Refine circuit-label spacing and use
the RVSOC palette consistently in the slides and abstract diagrams.
Update the generation sources, previews, and publication records together.

Validation: 35 tests, local privacy and reference checks, and native Word
and PowerPoint render reviews. Preserve the existing experiment results
and embedded gameplay video.
</commit_message>
<xml_diff>
--- a/docs/abstract/アブスト_主要事項.docx
+++ b/docs/abstract/アブスト_主要事項.docx
@@ -34,9 +34,10 @@
     <w:p>
       <w:pPr>
         <w:pStyle w:val="a9"/>
-      </w:pPr>
-      <w:r>
-        <w:t>本研究では，CPUに画面を描く機能を加え，ブロック崩しが動くゲーム機を製作した．CPUには，教科書RISC-V System-on-Chip Designで設計を学べるWally[Harris26]を用いた．目的は，Wallyの学習者が，CPUに別の回路をつないで機能を増やす際に参照できる例を示すことである．</w:t>
+        <w:keepLines/>
+      </w:pPr>
+      <w:r>
+        <w:t>FPGAは，ハードウェア記述言語（HDL）で記述した論理回路を実装できる半導体チップである．本研究では，教科書RISC-V System-on-Chip Design[1]で設計を学べるCPUであるWallyに描画・表示機能を追加し，FPGAボード上でブロック崩しを動かした．Wallyの学習者が，既存のCPUをゲーム機へ拡張する際に参照できる設計例を示すことを目的とする．</w:t>
       </w:r>
     </w:p>
     <w:p>
@@ -50,17 +51,28 @@
     <w:p>
       <w:pPr>
         <w:pStyle w:val="a9"/>
-      </w:pPr>
-      <w:r>
-        <w:t>FPGAは，内部に作る論理回路を変更できる半導体チップである．Nexys Videoという基板上のFPGAに，CPUのWallyと，画像を作る回路RasterIX[RasterIX]を実装した．CPUはSDカードから読み込んだゲームプログラムを実行し，ボールの位置などを計算する．</w:t>
+        <w:keepLines/>
+      </w:pPr>
+      <w:r>
+        <w:t>Nexys VideoのFPGAにWallyと描画回路RasterIX[2]，表示回路を実装した．ボード上には，FPGAチップの外にSDカードスロット，DDR3メモリ，HDMI端子があり，チップ内の制御回路を介して利用する．</w:t>
       </w:r>
     </w:p>
     <w:p>
       <w:pPr>
         <w:pStyle w:val="a9"/>
-      </w:pPr>
-      <w:r>
-        <w:t>ゲームプログラムは，RasterIX付属のOpenGL互換ライブラリ（図形を描くためのソフトウェア）に，図形の位置や色を渡す．ライブラリはそれを描画回路への命令に変換する．RasterIXは命令に従って画像を作り，各点（画素）の色をメモリに保存する．表示回路がその画像を読み出し，HDMI端子から映像として出力する（図1）．</w:t>
+        <w:keepLines/>
+      </w:pPr>
+      <w:r>
+        <w:t>CPUは，バス（回路間の通信経路）につながるSDカード制御回路を操作し，カード上のゲームプログラムをDDR3へ読み込む．DDR3への読み書きには，AMD提供のDDRメモリコントローラーを用いる．CPUは読み込んだプログラムを実行し，ボールの位置や衝突を計算する．</w:t>
+      </w:r>
+    </w:p>
+    <w:p>
+      <w:pPr>
+        <w:pStyle w:val="a9"/>
+        <w:keepLines/>
+      </w:pPr>
+      <w:r>
+        <w:t>本研究では，WallyのバスとRasterIXをつなぐ接続回路を設計した．接続回路には専用のアドレスを割り当て，CPUのストア命令（指定アドレスへ値を書く命令）で書いた数値をRasterIXへ渡す．このように周辺回路をメモリと同じ読み書きの仕組みで操作する方式を，MMIO（メモリマップドI/O）という．</w:t>
       </w:r>
     </w:p>
     <w:p>
@@ -72,8 +84,8 @@
       <w:r>
         <w:drawing>
           <wp:inline xmlns:a="http://schemas.openxmlformats.org/drawingml/2006/main" xmlns:pic="http://schemas.openxmlformats.org/drawingml/2006/picture">
-            <wp:extent cx="2988000" cy="2315700"/>
-            <wp:docPr id="201" name="Picture 201" descr="上からCPU Wally、描画回路RasterIX、画像を保存するメモリ、表示回路の順。CPUからの命令は接続回路を通る。青は追加した描画と表示の機能。"/>
+            <wp:extent cx="2988000" cy="2427750"/>
+            <wp:docPr id="205" name="Picture 205" descr="CPUのWallyが作った描画命令をMMIOの接続回路経由でRasterIXへ渡す。描画回路はDDR3の画像用領域へ各画素の色を保存し、表示回路が読み出してHDMI端子へ出力する。画像の読み書きはDDRメモリコントローラーを通る。線は処理の流れを表す。"/>
             <wp:cNvGraphicFramePr>
               <a:graphicFrameLocks noChangeAspect="1"/>
             </wp:cNvGraphicFramePr>
@@ -93,7 +105,7 @@
                   <pic:spPr>
                     <a:xfrm>
                       <a:off x="0" y="0"/>
-                      <a:ext cx="2988000" cy="2315700"/>
+                      <a:ext cx="2988000" cy="2427750"/>
                     </a:xfrm>
                     <a:prstGeom prst="rect"/>
                   </pic:spPr>
@@ -114,7 +126,7 @@
       <w:r>
         <w:rPr>
           <w:b/>
-          <w:color w:val="1673C3"/>
+          <w:color w:val="000000"/>
         </w:rPr>
         <w:t xml:space="preserve">図1  </w:t>
       </w:r>
@@ -123,15 +135,16 @@
           <w:b/>
           <w:color w:val="000000"/>
         </w:rPr>
-        <w:t>CPUの計算が画面になるまで</w:t>
+        <w:t>描画命令から映像出力までの処理</w:t>
       </w:r>
     </w:p>
     <w:p>
       <w:pPr>
         <w:pStyle w:val="a9"/>
-      </w:pPr>
-      <w:r>
-        <w:t>本研究で設計した接続回路は，CPUから来る命令を一時的に保存し，RasterIXが受け取れるときに順に渡す．この回路で，データの渡し方と動作のタイミングが異なる二つの回路をつないだ．また，プログラムと画像が互いの保存場所を上書きしないよう，メモリの使う範囲を分けた．表示中の画像を書き換えないように，二枚の画像を交互に描画用・表示用として使う制御も実装した．公式RasterIXの内部は変更していない．</w:t>
+        <w:keepLines/>
+      </w:pPr>
+      <w:r>
+        <w:t>ゲームプログラムは，RasterIX付属のOpenGL互換ライブラリに図形の位置や色を指定する．CPU上で動くライブラリが，図形の描き方を指示する数値列（描画命令）を作り，接続回路を通して送る．RasterIXは描画結果をDDR3の画像用領域へ保存し，表示回路がそれを読み出してHDMI端子へ映像を出力する（図1）．RasterIX本体には変更を加えていない．</w:t>
       </w:r>
     </w:p>
     <w:p>
@@ -139,32 +152,25 @@
         <w:pStyle w:val="1"/>
       </w:pPr>
       <w:r>
-        <w:br w:type="column"/>
         <w:t xml:space="preserve">3  動作の確認</w:t>
       </w:r>
     </w:p>
     <w:p>
       <w:pPr>
         <w:pStyle w:val="a9"/>
-      </w:pPr>
-      <w:r>
-        <w:t>回路シミュレーションでは，描画回路の受け取りを一時的に止め，再開後に命令が欠けたり重複したりせずに届くことを確認した．</w:t>
+        <w:keepLines/>
+      </w:pPr>
+      <w:r>
+        <w:t>実機で640×480画素のブロック崩しを動かした．四つの条件で，実機メモリ内のゲーム画像をCPUで別途作成した比較用画像と照合し，各画像の全画素が一致した．</w:t>
       </w:r>
     </w:p>
     <w:p>
       <w:pPr>
         <w:pStyle w:val="a9"/>
-      </w:pPr>
-      <w:r>
-        <w:t>実機では640×480画素のブロック崩しを動かした．実機のメモリから取り出した四枚のゲーム画像を，CPUで別に作った比較用画像と照合したところ，全画素の色が一致した．</w:t>
-      </w:r>
-    </w:p>
-    <w:p>
-      <w:pPr>
-        <w:pStyle w:val="a9"/>
-      </w:pPr>
-      <w:r>
-        <w:t>自動操作による5分間の実行では，ゲームの計算と画面の更新が続いた．別の実行で記録した30秒間の映像でも，ボールが動くことを確認した（図2）．試験には，描画処理を軽くする工夫を加えたゲームを用いた．</w:t>
+        <w:keepLines/>
+      </w:pPr>
+      <w:r>
+        <w:t>自動操作による5分間の実行で，ゲームの計算と画面の更新が続くことを確認した．別の試行で記録した30秒間の映像でも，ボールの動きを確認した（図2）．専用コントローラーによる操作は未実装である．</w:t>
       </w:r>
     </w:p>
     <w:p>
@@ -177,7 +183,7 @@
         <w:drawing>
           <wp:inline xmlns:a="http://schemas.openxmlformats.org/drawingml/2006/main" xmlns:pic="http://schemas.openxmlformats.org/drawingml/2006/picture">
             <wp:extent cx="2988000" cy="1680750"/>
-            <wp:docPr id="202" name="Picture 202" descr="実機のHDMI映像から取り出したブロック崩しの画面。色付きのブロック、白いボールとパドルが描かれている。自動操作で確認した。"/>
+            <wp:docPr id="206" name="Picture 206" descr="実機のHDMI映像から取り出したブロック崩しの画面。色付きのブロック、白いボールとパドルが描かれている。自動操作で確認した。"/>
             <wp:cNvGraphicFramePr>
               <a:graphicFrameLocks noChangeAspect="1"/>
             </wp:cNvGraphicFramePr>
@@ -185,7 +191,7 @@
               <a:graphicData uri="http://schemas.openxmlformats.org/drawingml/2006/picture">
                 <pic:pic>
                   <pic:nvPicPr>
-                    <pic:cNvPr id="0" name="fifo-study-game.png"/>
+                    <pic:cNvPr id="0" name="image.png"/>
                     <pic:cNvPicPr/>
                   </pic:nvPicPr>
                   <pic:blipFill>
@@ -218,7 +224,7 @@
       <w:r>
         <w:rPr>
           <w:b/>
-          <w:color w:val="1673C3"/>
+          <w:color w:val="000000"/>
         </w:rPr>
         <w:t xml:space="preserve">図2  </w:t>
       </w:r>
@@ -241,9 +247,10 @@
     <w:p>
       <w:pPr>
         <w:pStyle w:val="a9"/>
-      </w:pPr>
-      <w:r>
-        <w:t>Wallyに描画・表示機能を加え，二次元ゲームを動かせた．回路のつなぎ方と動作確認の手順を公開し，Wallyに機能を追加する学習者が参照できる例とした．映像を受信できない場合があり，原因の解明が課題である．最終発表ではWii Classic Controller Proを接続し，ボタンによるゲーム操作を確認する．</w:t>
+        <w:keepLines/>
+      </w:pPr>
+      <w:r>
+        <w:t>既存のCPUと描画回路を接続し，ゲームプログラムの実行から画面表示までをFPGAボード上で実現した．設計と動作確認の資料を公開し，Wallyをゲーム機へ拡張する例を示した．映像取込環境で受信できない場合の原因調査と，Wii Classic Controller Proによるゲーム操作の実装を今後の課題とする．</w:t>
       </w:r>
     </w:p>
     <w:p>
@@ -257,21 +264,23 @@
     <w:p>
       <w:pPr>
         <w:pStyle w:val="ad"/>
+        <w:keepLines/>
         <w:ind w:left="210" w:hanging="210"/>
         <w:jc w:val="left"/>
       </w:pPr>
       <w:r>
-        <w:t>[Harris26] D. Harrisほか，RISC-V System-on-Chip Design，Morgan Kaufmann，2026．</w:t>
+        <w:t>[1] D. Harrisほか，RISC-V System-on-Chip Design，Morgan Kaufmann，2026．</w:t>
       </w:r>
     </w:p>
     <w:p>
       <w:pPr>
         <w:pStyle w:val="ad"/>
+        <w:keepLines/>
         <w:ind w:left="210" w:hanging="210"/>
         <w:jc w:val="left"/>
       </w:pPr>
       <w:r>
-        <w:t>[RasterIX] ToNi3141，RasterIX，https://github.com/ToNi3141/RasterIX （使用版9269a01c9bd4，参照2026-10-09）．</w:t>
+        <w:t>[2] ToNi3141，RasterIX，https://github.com/ToNi3141/RasterIX （使用版9269a01c9bd4，参照2026-10-09）．</w:t>
       </w:r>
     </w:p>
     <w:sectPr>

</xml_diff>